<commit_message>
Report: restrict references to 2021-2026 sources
Rewrite the literature review and reference list to cite only works
published 2021-2026, update in-text citations in chapters 3-6, and add
a Streamlit documentation citation.

Co-Authored-By: Claude Opus 5.5 <noreply@anthropic.com>
Claude-Session: https://claude.ai/code/session_01Fsxs9EeFMWahVgQr6RJYuW
</commit_message>
<xml_diff>
--- a/saudi_restaurant_analytics/docs/Graduation_Report_DRAFT.docx
+++ b/saudi_restaurant_analytics/docs/Graduation_Report_DRAFT.docx
@@ -1921,7 +1921,7 @@
         <w:jc w:val="both"/>
       </w:pPr>
       <w:r>
-        <w:t xml:space="preserve">This chapter reviews the research that underpins the project. It begins with the main concepts and levels of sentiment analysis, then compares the three families of approaches: lexicon-based methods, classical machine learning and deep learning. It then focuses on aspect-based sentiment analysis, the specific task this project implements, before turning to the particular challenges and resources of Arabic and Saudi-dialect sentiment analysis. The chapter closes with the evaluation practices used in the field, a summary of the related work and the research gap that motivates the project.</w:t>
+        <w:t xml:space="preserve">This chapter reviews recent research (2021 to 2026) that underpins the project. It begins with the main concepts and levels of sentiment analysis, then compares the families of approaches: lexicon-based methods, classical machine learning, pre-trained language models and large language models. It then focuses on aspect-based sentiment analysis, the task this project implements, before turning to the challenges and resources of Arabic and Saudi-dialect sentiment analysis, including recent work on Saudi restaurant reviews. The chapter closes with evaluation practices, a summary of the related work and the research gap that motivates the project.</w:t>
       </w:r>
     </w:p>
     <w:p>
@@ -1938,7 +1938,7 @@
         <w:jc w:val="both"/>
       </w:pPr>
       <w:r>
-        <w:t xml:space="preserve">Sentiment analysis, also called opinion mining, is the computational study of people's opinions, evaluations and attitudes towards entities such as products, services and organisations and towards their attributes (Liu, 2012; Pang &amp; Lee, 2008). An opinion can be described by who holds it, what it is about, what it says and when it was expressed. In practice most systems focus on the polarity of the opinion, which is usually positive, negative or neutral, and on its target.</w:t>
+        <w:t xml:space="preserve">Sentiment analysis is the automatic extraction of the positive or negative orientation that a writer expresses towards an object, such as a product, a service or a person (Jurafsky &amp; Martin, 2026). In practice most systems classify the polarity of a text as positive, negative or neutral, and many also identify the target of the opinion.</w:t>
       </w:r>
     </w:p>
     <w:p>
@@ -1947,7 +1947,7 @@
         <w:jc w:val="both"/>
       </w:pPr>
       <w:r>
-        <w:t xml:space="preserve">Research distinguishes three levels of analysis (Liu, 2012):</w:t>
+        <w:t xml:space="preserve">Research distinguishes three levels of analysis (Zhang et al., 2023):</w:t>
       </w:r>
     </w:p>
     <w:p>
@@ -1968,7 +1968,7 @@
         <w:t xml:space="preserve">Document level</w:t>
       </w:r>
       <w:r>
-        <w:t xml:space="preserve"> assigns one polarity to a whole review. It assumes that the document expresses a single opinion about a single entity, which is rarely true of restaurant reviews.</w:t>
+        <w:t xml:space="preserve"> assigns one polarity to a whole review. It assumes that the review expresses a single opinion about a single entity, which is rarely true of restaurant reviews.</w:t>
       </w:r>
     </w:p>
     <w:p>
@@ -1989,7 +1989,7 @@
         <w:t xml:space="preserve">Sentence level</w:t>
       </w:r>
       <w:r>
-        <w:t xml:space="preserve"> assigns a polarity to each sentence. It is finer, but a sentence such as ‎"الأكل لذيذ بس غالي"‎ still contains two opinions about two different targets.</w:t>
+        <w:t xml:space="preserve"> assigns a polarity to each sentence. It is finer, but a sentence such as ‎"الأكل لذيذ بس غالي"‎ (the food is tasty but expensive) still contains two opinions about two different targets.</w:t>
       </w:r>
     </w:p>
     <w:p>
@@ -2019,7 +2019,7 @@
         <w:jc w:val="both"/>
       </w:pPr>
       <w:r>
-        <w:t xml:space="preserve">Sentiment analysis has been applied to product reviews, social media, politics and finance. Reviews of services such as hotels and restaurants are a particularly common application because they are plentiful, explicitly evaluative and organised around a small number of well-understood aspects (Pontiki et al., 2014).</w:t>
+        <w:t xml:space="preserve">Reviews of services such as hotels and restaurants are among the most common applications of sentiment analysis, because they are plentiful, explicitly evaluative and organised around a small number of well-understood aspects (Zhang et al., 2023).</w:t>
       </w:r>
     </w:p>
     <w:p>
@@ -2044,7 +2044,7 @@
         <w:jc w:val="both"/>
       </w:pPr>
       <w:r>
-        <w:t xml:space="preserve">Lexicon-based methods rely on a dictionary of words and phrases annotated with their sentiment polarity and, usually, a strength. The sentiment of a text is computed by combining the scores of the words it contains, with rules that modify these scores. Taboada et al. (2011) showed that a carefully built lexicon combined with rules for intensification, negation and irrealis markers performs robustly across domains, and argued that such methods are transparent and do not depend on labelled training data. Hu and Liu (2004) used a lexicon of opinion words, expanded through synonym relations, to summarise customer reviews by product feature.</w:t>
+        <w:t xml:space="preserve">Lexicon-based methods rely on a dictionary of words and phrases annotated with their polarity and, usually, a strength. The sentiment of a text is computed by combining the scores of the words it contains, with rules that modify those scores, for example for negation (Jurafsky &amp; Martin, 2026). Their main strengths are interpretability, since every decision can be traced to specific words and rules, and independence from labelled training data. In a recent survey of Arabic sentiment analysis, Shi and Agrawal (2025) trace the field's move from lexicon-based methods towards deep learning, but note that sentiment lexicons remain valuable because they show how a classification was reached.</w:t>
       </w:r>
     </w:p>
     <w:p>
@@ -2053,7 +2053,7 @@
         <w:jc w:val="left"/>
       </w:pPr>
       <w:r>
-        <w:t xml:space="preserve">The main strengths of lexicon-based methods are interpretability, since every decision can be traced to specific words and rules, and independence from training data. Their weaknesses are limited coverage of informal and domain-specific vocabulary, difficulty with context-dependent words (for example ‎"بارد"‎, cold, is negative for food but positive for a drink), and difficulty with sarcasm. These strengths and weaknesses are directly relevant to this project, because Saudi dialect contains many words that general lexicons do not cover.</w:t>
+        <w:t xml:space="preserve">Their weaknesses are limited coverage of informal and domain-specific vocabulary, difficulty with context-dependent words (for example ‎"بارد"‎, cold, is negative for food but positive for a drink), and difficulty with sarcasm. These weaknesses are directly relevant to this project, because Saudi dialect contains many words that general lexicons do not cover.</w:t>
       </w:r>
     </w:p>
     <w:p>
@@ -2070,7 +2070,7 @@
         <w:jc w:val="both"/>
       </w:pPr>
       <w:r>
-        <w:t xml:space="preserve">Supervised machine-learning methods learn a classifier from texts labelled with their sentiment. Early influential work represented documents as bags of words and n-grams and trained classifiers such as Naive Bayes, support vector machines and logistic regression (Pang &amp; Lee, 2008). The term frequency-inverse document frequency (TF-IDF) weighting scheme, which gives more weight to terms that are frequent in a document but rare in the collection, remains a standard and strong representation for text classification (Manning et al., 2008). Character n-grams are particularly useful for morphologically rich and noisy text, because they capture shared sub-word units even when spelling varies. Libraries such as scikit-learn make these models easy to build and evaluate (Pedregosa et al., 2011).</w:t>
+        <w:t xml:space="preserve">Supervised machine-learning methods learn a classifier from texts labelled with their sentiment. A standard and strong baseline represents each text with term frequency-inverse document frequency (TF-IDF) weights over words or n-grams and trains a linear classifier such as logistic regression (Jurafsky &amp; Martin, 2026). Character n-grams are particularly useful for morphologically rich and noisy text, because they capture shared sub-word units even when spelling varies. Libraries such as scikit-learn provide tested implementations of these representations, classifiers and evaluation metrics (scikit-learn developers, 2026).</w:t>
       </w:r>
     </w:p>
     <w:p>
@@ -2079,7 +2079,7 @@
         <w:jc w:val="both"/>
       </w:pPr>
       <w:r>
-        <w:t xml:space="preserve">Machine-learning models adapt to the vocabulary of their training data and can capture patterns that are hard to write as rules. However, they require labelled data from the target domain, they are less transparent than lexicon methods, and they typically classify a whole text rather than individual aspects unless they are designed specifically for ABSA.</w:t>
+        <w:t xml:space="preserve">Machine-learning models adapt to the vocabulary of their training data and can capture patterns that are hard to write as rules. However, they require labelled data from the target domain, they are less transparent than lexicon methods, and they classify a whole text unless they are designed specifically for aspect-level analysis.</w:t>
       </w:r>
     </w:p>
     <w:p>
@@ -2087,7 +2087,7 @@
         <w:pStyle w:val="Heading3"/>
       </w:pPr>
       <w:r>
-        <w:t xml:space="preserve">2.3.3 Deep Learning and Pre-trained Language Models</w:t>
+        <w:t xml:space="preserve">2.3.3 Pre-trained Language Models</w:t>
       </w:r>
     </w:p>
     <w:p>
@@ -2096,7 +2096,7 @@
         <w:jc w:val="both"/>
       </w:pPr>
       <w:r>
-        <w:t xml:space="preserve">Deep learning has become the dominant paradigm in sentiment analysis research. Recurrent and convolutional neural networks were followed by attention-based models, and more recently by pre-trained Transformer language models that are fine-tuned on a specific task (Zhang et al., 2018). For Arabic, AraBERT (Antoun et al., 2020) and the CAMeLBERT family (Inoue et al., 2021) are BERT-style models pre-trained on large Arabic corpora; Inoue et al. (2021) studied how the variant of Arabic used in pre-training, whether Modern Standard, dialectal, classical or a mixture, affects performance on different tasks, including sentiment analysis.</w:t>
+        <w:t xml:space="preserve">Pre-trained Transformer language models, fine-tuned on a specific task, have become the dominant approach in sentiment analysis research. Several such models were built for Arabic. ARBERT and MARBERT were pre-trained on large collections of Modern Standard and dialectal Arabic, the latter including social-media text, and were evaluated on a multi-dialect Arabic benchmark that includes sentiment tasks (Abdul-Mageed et al., 2021). The CAMeLBERT family was used to study how the variant of Arabic used in pre-training (Modern Standard, dialectal, classical or mixed) affects performance on different tasks, including sentiment analysis (Inoue et al., 2021).</w:t>
       </w:r>
     </w:p>
     <w:p>
@@ -2105,15 +2105,15 @@
         <w:jc w:val="both"/>
       </w:pPr>
       <w:r>
-        <w:t xml:space="preserve">Fine-tuned Transformers generally achieve the strongest accuracy on benchmark datasets, but they require GPU resources for training, are harder to explain, and may transfer imperfectly to a new domain or dialect. For a graduation project that must run locally and explain its decisions to non-technical users, these costs are significant, which is why this project uses an interpretable lexicon-based analyser as its core, a classical machine-learning model as a baseline, and supports pre-trained Transformers only as an optional extension.</w:t>
-      </w:r>
-    </w:p>
-    <w:p>
-      <w:pPr>
-        <w:pStyle w:val="Heading2"/>
-      </w:pPr>
-      <w:r>
-        <w:t xml:space="preserve">2.4 Aspect-Based Sentiment Analysis</w:t>
+        <w:t xml:space="preserve">Fine-tuned Transformers generally achieve the strongest accuracy on benchmarks, but they require GPU resources for training and are harder to explain. For a project that must run locally and explain its decisions to non-technical users, these costs are significant.</w:t>
+      </w:r>
+    </w:p>
+    <w:p>
+      <w:pPr>
+        <w:pStyle w:val="Heading3"/>
+      </w:pPr>
+      <w:r>
+        <w:t xml:space="preserve">2.3.4 Large Language Models</w:t>
       </w:r>
     </w:p>
     <w:p>
@@ -2122,7 +2122,24 @@
         <w:jc w:val="both"/>
       </w:pPr>
       <w:r>
-        <w:t xml:space="preserve">Aspect-based sentiment analysis aims to identify the aspects of an entity that are discussed in a text and the sentiment expressed towards each of them (Schouten &amp; Frasincar, 2016). It is usually decomposed into sub-tasks:</w:t>
+        <w:t xml:space="preserve">Large language models (LLMs) such as ChatGPT and GPT-4 can classify sentiment from instructions alone, without task-specific training. Their performance on Arabic is mixed. In a large evaluation over dozens of Arabic tasks, Khondaker et al. (2023) found that ChatGPT performed worse than much smaller models fine-tuned for Arabic on most tasks, and that both ChatGPT and GPT-4 performed worse on dialectal Arabic than on Modern Standard Arabic. Al-Thubaity et al. (2023), evaluating dialectal Arabic sentiment specifically, found that GPT-4 outperformed GPT-3.5 and Bard and rivalled the best fully supervised BERT-based model. LLMs therefore show promise, but they depend on paid or cloud services, raise privacy questions when customer data is sent to them, and are hard to audit. These are the reasons this project did not use them.</w:t>
+      </w:r>
+    </w:p>
+    <w:p>
+      <w:pPr>
+        <w:pStyle w:val="Heading2"/>
+      </w:pPr>
+      <w:r>
+        <w:t xml:space="preserve">2.4 Aspect-Based Sentiment Analysis</w:t>
+      </w:r>
+    </w:p>
+    <w:p>
+      <w:pPr>
+        <w:spacing w:after="120"/>
+        <w:jc w:val="both"/>
+      </w:pPr>
+      <w:r>
+        <w:t xml:space="preserve">Aspect-based sentiment analysis (ABSA) identifies the aspects of an entity that are discussed in a text and the sentiment expressed towards each of them. Zhang et al. (2023) describe ABSA in terms of four sentiment elements and the tasks built on them:</w:t>
       </w:r>
     </w:p>
     <w:p>
@@ -2140,10 +2157,10 @@
           <w:b/>
           <w:bCs/>
         </w:rPr>
-        <w:t xml:space="preserve">Aspect term extraction:</w:t>
-      </w:r>
-      <w:r>
-        <w:t xml:space="preserve"> finding the words that refer to an aspect, such as ‎"الخدمة"‎ (the service) or ‎"الكبسة"‎ (the kabsa).</w:t>
+        <w:t xml:space="preserve">Aspect term:</w:t>
+      </w:r>
+      <w:r>
+        <w:t xml:space="preserve"> the words that refer to an aspect, such as ‎"الخدمة"‎ (the service) or ‎"الكبسة"‎ (the kabsa).</w:t>
       </w:r>
     </w:p>
     <w:p>
@@ -2161,10 +2178,31 @@
           <w:b/>
           <w:bCs/>
         </w:rPr>
-        <w:t xml:space="preserve">Aspect category detection:</w:t>
-      </w:r>
-      <w:r>
-        <w:t xml:space="preserve"> assigning the text to predefined categories such as FOOD#QUALITY or SERVICE#GENERAL.</w:t>
+        <w:t xml:space="preserve">Aspect category:</w:t>
+      </w:r>
+      <w:r>
+        <w:t xml:space="preserve"> a predefined category such as food quality or service.</w:t>
+      </w:r>
+    </w:p>
+    <w:p>
+      <w:pPr>
+        <w:pStyle w:val="ListParagraph"/>
+        <w:numPr>
+          <w:ilvl w:val="0"/>
+          <w:numId w:val="4"/>
+        </w:numPr>
+        <w:spacing w:after="60"/>
+        <w:jc w:val="left"/>
+      </w:pPr>
+      <w:r>
+        <w:rPr>
+          <w:b/>
+          <w:bCs/>
+        </w:rPr>
+        <w:t xml:space="preserve">Opinion term:</w:t>
+      </w:r>
+      <w:r>
+        <w:t xml:space="preserve"> the words that express the opinion, such as ‎"لذيذة"‎ (tasty).</w:t>
       </w:r>
     </w:p>
     <w:p>
@@ -2182,10 +2220,137 @@
           <w:b/>
           <w:bCs/>
         </w:rPr>
-        <w:t xml:space="preserve">Aspect sentiment classification:</w:t>
-      </w:r>
-      <w:r>
-        <w:t xml:space="preserve"> deciding the polarity expressed towards each aspect.</w:t>
+        <w:t xml:space="preserve">Sentiment polarity:</w:t>
+      </w:r>
+      <w:r>
+        <w:t xml:space="preserve"> positive, negative or neutral.</w:t>
+      </w:r>
+    </w:p>
+    <w:p>
+      <w:pPr>
+        <w:spacing w:after="120"/>
+        <w:jc w:val="both"/>
+      </w:pPr>
+      <w:r>
+        <w:t xml:space="preserve">Single tasks extract one element, while compound tasks extract several together, such as aspect-category-sentiment pairs or triplets that also include the opinion text (Zhang et al., 2023). The AQTE dataset used in this project follows the compound view: each annotation is a triplet of aspect category, sentiment polarity and the verbatim opinion quote (bayandashnan, 2026). Zhang et al. (2023) also review the benchmark datasets of the field, in which restaurant reviews are one of the most common domains, and the shift from rule-based and feature-based methods to pre-trained language models.</w:t>
+      </w:r>
+    </w:p>
+    <w:p>
+      <w:pPr>
+        <w:spacing w:after="120"/>
+        <w:jc w:val="left"/>
+      </w:pPr>
+      <w:r>
+        <w:t xml:space="preserve">Rule-based ABSA systems usually detect aspects with keyword lists and assign each opinion word to the nearest aspect. This proximity-based assignment within a clause is the strategy adopted by this project, extended with contrast-aware clause splitting and implicit aspects; for example, ‎"غالي"‎ (expensive) always refers to price.</w:t>
+      </w:r>
+    </w:p>
+    <w:p>
+      <w:pPr>
+        <w:pStyle w:val="Heading2"/>
+      </w:pPr>
+      <w:r>
+        <w:t xml:space="preserve">2.5 Arabic Sentiment Analysis</w:t>
+      </w:r>
+    </w:p>
+    <w:p>
+      <w:pPr>
+        <w:pStyle w:val="Heading3"/>
+      </w:pPr>
+      <w:r>
+        <w:t xml:space="preserve">2.5.1 Challenges of Arabic</w:t>
+      </w:r>
+    </w:p>
+    <w:p>
+      <w:pPr>
+        <w:spacing w:after="120"/>
+        <w:jc w:val="both"/>
+      </w:pPr>
+      <w:r>
+        <w:t xml:space="preserve">Arabic has received much less sentiment-analysis research attention than English, and building robust Arabic models faces specific obstacles (Shi &amp; Agrawal, 2025; Bensoltane &amp; Zaki, 2022):</w:t>
+      </w:r>
+    </w:p>
+    <w:p>
+      <w:pPr>
+        <w:pStyle w:val="ListParagraph"/>
+        <w:numPr>
+          <w:ilvl w:val="0"/>
+          <w:numId w:val="4"/>
+        </w:numPr>
+        <w:spacing w:after="60"/>
+        <w:jc w:val="left"/>
+      </w:pPr>
+      <w:r>
+        <w:rPr>
+          <w:b/>
+          <w:bCs/>
+        </w:rPr>
+        <w:t xml:space="preserve">Rich morphology.</w:t>
+      </w:r>
+      <w:r>
+        <w:t xml:space="preserve"> Conjunctions, prepositions, the definite article and pronouns attach to words, so ‎"وبالخدمة"‎ contains the word ‎"خدمة"‎ with three prefixes, and ‎"خدمتهم"‎ contains it with a pronoun suffix that also changes the final ta marbuta ‎"ة"‎ into ‎"ت"‎.</w:t>
+      </w:r>
+    </w:p>
+    <w:p>
+      <w:pPr>
+        <w:pStyle w:val="ListParagraph"/>
+        <w:numPr>
+          <w:ilvl w:val="0"/>
+          <w:numId w:val="4"/>
+        </w:numPr>
+        <w:spacing w:after="60"/>
+        <w:jc w:val="left"/>
+      </w:pPr>
+      <w:r>
+        <w:rPr>
+          <w:b/>
+          <w:bCs/>
+        </w:rPr>
+        <w:t xml:space="preserve">Orthographic variation.</w:t>
+      </w:r>
+      <w:r>
+        <w:t xml:space="preserve"> Writers use different forms of alef (أ، إ، آ، ا), interchange ta marbuta ‎"ة"‎ and ha ‎"ه"‎ and alef maqsura ‎"ى"‎ and ya ‎"ي"‎, and usually omit diacritics.</w:t>
+      </w:r>
+    </w:p>
+    <w:p>
+      <w:pPr>
+        <w:pStyle w:val="ListParagraph"/>
+        <w:numPr>
+          <w:ilvl w:val="0"/>
+          <w:numId w:val="4"/>
+        </w:numPr>
+        <w:spacing w:after="60"/>
+        <w:jc w:val="left"/>
+      </w:pPr>
+      <w:r>
+        <w:rPr>
+          <w:b/>
+          <w:bCs/>
+        </w:rPr>
+        <w:t xml:space="preserve">Dialects.</w:t>
+      </w:r>
+      <w:r>
+        <w:t xml:space="preserve"> Online reviews are written mostly in regional dialects whose vocabulary and negation differ from Modern Standard Arabic. Saudi reviewers write ‎"مو حلو"‎ (not good), ‎"زين"‎ (good), ‎"رهيب"‎ (awesome), ‎"ماصخ"‎ (bland) and ‎"وايد"‎ (very).</w:t>
+      </w:r>
+    </w:p>
+    <w:p>
+      <w:pPr>
+        <w:pStyle w:val="ListParagraph"/>
+        <w:numPr>
+          <w:ilvl w:val="0"/>
+          <w:numId w:val="4"/>
+        </w:numPr>
+        <w:spacing w:after="60"/>
+        <w:jc w:val="left"/>
+      </w:pPr>
+      <w:r>
+        <w:rPr>
+          <w:b/>
+          <w:bCs/>
+        </w:rPr>
+        <w:t xml:space="preserve">Informal writing.</w:t>
+      </w:r>
+      <w:r>
+        <w:t xml:space="preserve"> Letter elongation (‎"حلووووو"‎), emojis, mixed Arabic and English, and creative spelling are common.</w:t>
       </w:r>
     </w:p>
     <w:p>
@@ -2203,10 +2368,18 @@
           <w:b/>
           <w:bCs/>
         </w:rPr>
-        <w:t xml:space="preserve">Opinion or quote extraction:</w:t>
-      </w:r>
-      <w:r>
-        <w:t xml:space="preserve"> identifying the exact span of text that expresses the opinion, which provides evidence for the decision.</w:t>
+        <w:t xml:space="preserve">Sarcasm.</w:t>
+      </w:r>
+      <w:r>
+        <w:t xml:space="preserve"> Sarcasm reverses the literal meaning of positive words. The WANLP 2021 shared task on sarcasm and sentiment detection in Arabic showed that sarcasm detection remains difficult even for fine-tuned Transformers (Abu Farha et al., 2021).</w:t>
+      </w:r>
+    </w:p>
+    <w:p>
+      <w:pPr>
+        <w:pStyle w:val="Heading3"/>
+      </w:pPr>
+      <w:r>
+        <w:t xml:space="preserve">2.5.2 Saudi-Dialect Resources</w:t>
       </w:r>
     </w:p>
     <w:p>
@@ -2215,24 +2388,7 @@
         <w:jc w:val="both"/>
       </w:pPr>
       <w:r>
-        <w:t xml:space="preserve">The SemEval shared tasks played a major role in standardising ABSA. SemEval-2014 Task 4 provided English restaurant and laptop reviews annotated with aspect terms, categories and polarities (Pontiki et al., 2014). SemEval-2016 Task 5 extended the task to several languages and domains, including Arabic hotel reviews (Pontiki et al., 2016). Restaurant reviews have remained one of the most common benchmark domains for ABSA.</w:t>
-      </w:r>
-    </w:p>
-    <w:p>
-      <w:pPr>
-        <w:spacing w:after="120"/>
-        <w:jc w:val="left"/>
-      </w:pPr>
-      <w:r>
-        <w:t xml:space="preserve">Schouten and Frasincar (2016) survey ABSA methods and group them into dictionary-based, supervised machine-learning, unsupervised and hybrid approaches. Dictionary and rule-based approaches typically detect aspects with keyword lists and assign each opinion word to the nearest aspect, using syntactic or proximity rules. This proximity-based assignment within a clause is the strategy adopted by this project, extended with contrast-aware clause splitting and implicit aspects (for example ‎"غالي"‎, expensive, always refers to price).</w:t>
-      </w:r>
-    </w:p>
-    <w:p>
-      <w:pPr>
-        <w:pStyle w:val="Heading2"/>
-      </w:pPr>
-      <w:r>
-        <w:t xml:space="preserve">2.5 Arabic Sentiment Analysis</w:t>
+        <w:t xml:space="preserve">Freely available Saudi-dialect datasets and lexicons are scarcer than those for some other Arabic dialects. Almuqren and Cristea (2021) addressed this by building AraCust, a gold-standard corpus of Saudi-dialect tweets about telecommunications companies annotated for sentiment, and showed that a supervised classifier trained on it performed well. Their work illustrates the importance of domain and dialect: resources built for one domain or dialect often transfer poorly to another, which motivates domain-specific resources for restaurants.</w:t>
       </w:r>
     </w:p>
     <w:p>
@@ -2240,7 +2396,7 @@
         <w:pStyle w:val="Heading3"/>
       </w:pPr>
       <w:r>
-        <w:t xml:space="preserve">2.5.1 Challenges of Arabic</w:t>
+        <w:t xml:space="preserve">2.5.3 Saudi Restaurant Reviews</w:t>
       </w:r>
     </w:p>
     <w:p>
@@ -2249,112 +2405,7 @@
         <w:jc w:val="both"/>
       </w:pPr>
       <w:r>
-        <w:t xml:space="preserve">Arabic presents a set of well-documented challenges for NLP (Habash, 2010; Boudad et al., 2018):</w:t>
-      </w:r>
-    </w:p>
-    <w:p>
-      <w:pPr>
-        <w:pStyle w:val="ListParagraph"/>
-        <w:numPr>
-          <w:ilvl w:val="0"/>
-          <w:numId w:val="4"/>
-        </w:numPr>
-        <w:spacing w:after="60"/>
-        <w:jc w:val="left"/>
-      </w:pPr>
-      <w:r>
-        <w:rPr>
-          <w:b/>
-          <w:bCs/>
-        </w:rPr>
-        <w:t xml:space="preserve">Rich morphology.</w:t>
-      </w:r>
-      <w:r>
-        <w:t xml:space="preserve"> Conjunctions, prepositions, the definite article and pronouns attach to words, so ‎"وبالخدمة"‎ contains the word ‎"خدمة"‎ together with three prefixes, and ‎"خدمتهم"‎ contains it with a pronoun suffix that also changes the final ta marbuta ‎"ة"‎ into ‎"ت"‎.</w:t>
-      </w:r>
-    </w:p>
-    <w:p>
-      <w:pPr>
-        <w:pStyle w:val="ListParagraph"/>
-        <w:numPr>
-          <w:ilvl w:val="0"/>
-          <w:numId w:val="4"/>
-        </w:numPr>
-        <w:spacing w:after="60"/>
-        <w:jc w:val="left"/>
-      </w:pPr>
-      <w:r>
-        <w:rPr>
-          <w:b/>
-          <w:bCs/>
-        </w:rPr>
-        <w:t xml:space="preserve">Orthographic variation.</w:t>
-      </w:r>
-      <w:r>
-        <w:t xml:space="preserve"> Writers use different forms of alef (أ، إ، آ، ا), interchange ta marbuta ‎"ة"‎ and ha ‎"ه"‎ and alef maqsura ‎"ى"‎ and ya ‎"ي"‎, and usually omit diacritics.</w:t>
-      </w:r>
-    </w:p>
-    <w:p>
-      <w:pPr>
-        <w:pStyle w:val="ListParagraph"/>
-        <w:numPr>
-          <w:ilvl w:val="0"/>
-          <w:numId w:val="4"/>
-        </w:numPr>
-        <w:spacing w:after="60"/>
-        <w:jc w:val="left"/>
-      </w:pPr>
-      <w:r>
-        <w:rPr>
-          <w:b/>
-          <w:bCs/>
-        </w:rPr>
-        <w:t xml:space="preserve">Diglossia and dialects.</w:t>
-      </w:r>
-      <w:r>
-        <w:t xml:space="preserve"> Online reviews are written mostly in regional dialects whose vocabulary, negation and grammar differ from Modern Standard Arabic. Saudi reviewers write ‎"مو حلو"‎ (not good), ‎"زين"‎ (good), ‎"رهيب"‎ (awesome), ‎"ماصخ"‎ (bland) and ‎"وايد"‎ (very).</w:t>
-      </w:r>
-    </w:p>
-    <w:p>
-      <w:pPr>
-        <w:pStyle w:val="ListParagraph"/>
-        <w:numPr>
-          <w:ilvl w:val="0"/>
-          <w:numId w:val="4"/>
-        </w:numPr>
-        <w:spacing w:after="60"/>
-        <w:jc w:val="left"/>
-      </w:pPr>
-      <w:r>
-        <w:rPr>
-          <w:b/>
-          <w:bCs/>
-        </w:rPr>
-        <w:t xml:space="preserve">Informal writing.</w:t>
-      </w:r>
-      <w:r>
-        <w:t xml:space="preserve"> Letter elongation (‎"حلووووو"‎), emojis, mixed Arabic and English, and creative spelling are common.</w:t>
-      </w:r>
-    </w:p>
-    <w:p>
-      <w:pPr>
-        <w:pStyle w:val="ListParagraph"/>
-        <w:numPr>
-          <w:ilvl w:val="0"/>
-          <w:numId w:val="4"/>
-        </w:numPr>
-        <w:spacing w:after="60"/>
-        <w:jc w:val="left"/>
-      </w:pPr>
-      <w:r>
-        <w:rPr>
-          <w:b/>
-          <w:bCs/>
-        </w:rPr>
-        <w:t xml:space="preserve">Negation and sarcasm.</w:t>
-      </w:r>
-      <w:r>
-        <w:t xml:space="preserve"> Negation can be a separate word (‎"ما عجبني"‎) or attached (‎"ماعجبني"‎), and sarcasm reverses the literal meaning of positive words. Abu Farha and Magdy (2020) showed that sarcasm is common in Arabic social media and closely related to sentiment.</w:t>
+        <w:t xml:space="preserve">Restaurant reviews in Saudi Arabia have recently become a research topic in their own right. Alharbi and Qamar (2022) applied deep learning to sentiment analysis of Arabic reviews of eateries in the Qassim region. AlMasaud and Al-Baity (2023) built AraMA and AraMAMS, corpora of Google Maps reviews of restaurants in Riyadh annotated for aspect-based sentiment analysis with four aspects (food, environment, service and price) and positive, negative, neutral and conflict polarities, with AraMAMS containing only reviews that express at least two different sentiments. They reported strong results for aspect-category detection with classical machine-learning models. AQTE extends this line of work with Google Maps reviews of 774 restaurants across Saudi Arabia, 29 aspect categories and verbatim opinion quotes for every annotation (bayandashnan, 2026).</w:t>
       </w:r>
     </w:p>
     <w:p>
@@ -2362,7 +2413,7 @@
         <w:pStyle w:val="Heading3"/>
       </w:pPr>
       <w:r>
-        <w:t xml:space="preserve">2.5.2 Arabic Sentiment Resources</w:t>
+        <w:t xml:space="preserve">2.5.4 Arabic Aspect-Based Sentiment Analysis</w:t>
       </w:r>
     </w:p>
     <w:p>
@@ -2371,32 +2422,15 @@
         <w:jc w:val="both"/>
       </w:pPr>
       <w:r>
-        <w:t xml:space="preserve">A number of resources have been developed for Arabic sentiment analysis. LABR is a large-scale dataset of Arabic book reviews with star ratings (Aly &amp; Atiya, 2013). ASTD is a dataset of Arabic tweets annotated for sentiment (Nabil et al., 2015). HARD is a large dataset of Arabic hotel reviews (Elnagar et al., 2018). ElSahar and El-Beltagy (2015) built multi-domain Arabic resources for sentiment analysis, covering domains including restaurants, hotels, movies and products, together with domain lexicons. ArSenL is a large-scale Arabic sentiment lexicon (Badaro et al., 2014). These resources show both the feasibility of Arabic sentiment analysis and the importance of domain and dialect: a model or lexicon built for one domain or dialect often transfers poorly to another.</w:t>
-      </w:r>
-    </w:p>
-    <w:p>
-      <w:pPr>
-        <w:pStyle w:val="Heading3"/>
-      </w:pPr>
-      <w:r>
-        <w:t xml:space="preserve">2.5.3 Saudi-Dialect Sentiment Analysis</w:t>
-      </w:r>
-    </w:p>
-    <w:p>
-      <w:pPr>
-        <w:spacing w:after="120"/>
-        <w:jc w:val="left"/>
-      </w:pPr>
-      <w:r>
-        <w:t xml:space="preserve">Saudi dialect has received specific attention. Al-Twairesh et al. (2017) built AraSenTi-Tweet, a corpus of Saudi tweets annotated for sentiment, and highlighted the dialectal phenomena that make Saudi text difficult for systems built on Modern Standard Arabic. Assiri et al. (2018) proposed enhancements to a lexicon-based approach for Saudi dialect, showing that adding dialect-specific words and rules, including rules for negation and intensification, improves performance. These findings support the design choice of this project: a lexicon that combines Modern Standard Arabic with Saudi and Gulf vocabulary, with explicit rules for dialectal negation such as ‎"مو"‎, ‎"مب"‎ and ‎"ما"‎.</w:t>
-      </w:r>
-    </w:p>
-    <w:p>
-      <w:pPr>
-        <w:pStyle w:val="Heading3"/>
-      </w:pPr>
-      <w:r>
-        <w:t xml:space="preserve">2.5.4 Arabic Aspect-Based Sentiment Analysis</w:t>
+        <w:t xml:space="preserve">Arabic ABSA has been studied mostly on hotel reviews from the SemEval-2016 benchmark. Al-Dabet et al. (2021) developed deep-learning models for aspect-category identification and aspect sentiment classification on this dataset. Abdelgwad et al. (2022) combined bidirectional GRU networks with convolutional and attention layers for opinion-target extraction and aspect polarity classification, reporting large improvements over baselines. In a review of Arabic ABSA, Bensoltane and Zaki (2022) classify existing studies by approach and identify the scarcity of annotated resources, the dominance of a few domains, and dialectal variation as the main open challenges. These findings support two design choices of this project: evaluation on a domain-specific Saudi dataset, and a lexicon with explicit Saudi-dialect vocabulary and rules.</w:t>
+      </w:r>
+    </w:p>
+    <w:p>
+      <w:pPr>
+        <w:pStyle w:val="Heading2"/>
+      </w:pPr>
+      <w:r>
+        <w:t xml:space="preserve">2.6 Evaluation of Sentiment Classifiers</w:t>
       </w:r>
     </w:p>
     <w:p>
@@ -2405,15 +2439,7 @@
         <w:jc w:val="both"/>
       </w:pPr>
       <w:r>
-        <w:t xml:space="preserve">Arabic ABSA research has been driven largely by the Arabic hotel reviews of SemEval-2016 (Pontiki et al., 2016). Al-Smadi et al. (2018) compared a deep recurrent neural network with a support vector machine trained on rich hand-crafted features for ABSA of Arabic hotel reviews. They found that the deep model was faster to train and use, while the feature-based support vector machine performed better on some sub-tasks. Restaurant reviews in Saudi dialect, by contrast, have had fewer public aspect-level resources. The AQTE dataset used in this project (bayandashnan, n.d.) addresses this need by providing Saudi restaurant reviews from Google Maps annotated with complete opinion triplets: an aspect category, a sentiment polarity and the verbatim quote that expresses the opinion.</w:t>
-      </w:r>
-    </w:p>
-    <w:p>
-      <w:pPr>
-        <w:pStyle w:val="Heading2"/>
-      </w:pPr>
-      <w:r>
-        <w:t xml:space="preserve">2.6 Evaluation of Sentiment Classifiers</w:t>
+        <w:t xml:space="preserve">Sentiment classifiers are evaluated by comparing their output with human annotations using precision, recall and the F1 score for each class; with several classes, macro-averaging computes the measure for each class and averages the results, giving every class equal weight (Jurafsky &amp; Martin, 2026). Accuracy alone is misleading when classes are imbalanced. Restaurant reviews are predominantly positive, so a trivial model that always predicts "positive" can reach a high accuracy while being useless. For this reason macro-F1 is the preferred summary measure, and results should be reported together with a majority-class baseline and a confusion matrix. Some benchmarks avoid the difficult neutral class altogether: the WANLP 2021 shared task ranked sentiment systems by the average F1 of the positive and negative classes only (Abu Farha et al., 2021).</w:t>
       </w:r>
     </w:p>
     <w:p>
@@ -2422,16 +2448,7 @@
         <w:jc w:val="both"/>
       </w:pPr>
       <w:r>
-        <w:t xml:space="preserve">Sentiment classifiers are evaluated by comparing their output with human or curated annotations using precision, recall and the F1 score for each class (Sokolova &amp; Lapalme, 2009). Accuracy alone is misleading when classes are imbalanced. Restaurant reviews are predominantly positive, so a trivial model that always predicts "positive" can reach a high accuracy while being useless. For this reason the macro-averaged F1 score, which gives each class equal weight, is the preferred summary measure, and results should be reported together with a majority-class baseline and a confusion matrix.</w:t>
-      </w:r>
-    </w:p>
-    <w:p>
-      <w:pPr>
-        <w:spacing w:after="120"/>
-        <w:jc w:val="both"/>
-      </w:pPr>
-      <w:r>
-        <w:t xml:space="preserve">When results are aggregated to compare entities, for example the share of positive reviews for different restaurants, small samples produce unstable proportions. The Wilson score interval (Wilson, 1927) gives a confidence interval for a proportion that behaves well for small samples, and ranking by the lower bound of this interval prevents an entity with very few reviews from being ranked above one with many. This principle is used in the platform's restaurant comparison.</w:t>
+        <w:t xml:space="preserve">When results are aggregated to compare entities, for example the share of positive reviews for different restaurants, small samples produce unstable proportions. The Wilson score interval gives a confidence interval for a proportion that behaves well for small samples, and ranking by the lower bound of this interval prevents an entity with very few reviews from being ranked above one with many. This principle is used in the platform's restaurant comparison.</w:t>
       </w:r>
     </w:p>
     <w:p>
@@ -2451,7 +2468,7 @@
         <w:jc w:val="center"/>
       </w:pPr>
       <w:r>
-        <w:t xml:space="preserve">Table 2.1: Summary of related work and its relevance to this project</w:t>
+        <w:t xml:space="preserve">Table 2.1: Summary of related work (2021–2026) and its relevance to this project</w:t>
       </w:r>
     </w:p>
     <w:tbl>
@@ -2605,7 +2622,7 @@
                 <w:sz w:val="20"/>
                 <w:szCs w:val="20"/>
               </w:rPr>
-              <w:t xml:space="preserve">Hu &amp; Liu (2004)</w:t>
+              <w:t xml:space="preserve">Zhang et al. (2023)</w:t>
             </w:r>
           </w:p>
         </w:tc>
@@ -2635,7 +2652,7 @@
                 <w:sz w:val="20"/>
                 <w:szCs w:val="20"/>
               </w:rPr>
-              <w:t xml:space="preserve">Feature-based summarisation of customer reviews with an opinion lexicon</w:t>
+              <w:t xml:space="preserve">Survey of ABSA tasks, methods and datasets</w:t>
             </w:r>
           </w:p>
         </w:tc>
@@ -2665,7 +2682,7 @@
                 <w:sz w:val="20"/>
                 <w:szCs w:val="20"/>
               </w:rPr>
-              <w:t xml:space="preserve">Lexicon-based aspect summarisation</w:t>
+              <w:t xml:space="preserve">Task definition; triplet view of ABSA</w:t>
             </w:r>
           </w:p>
         </w:tc>
@@ -2700,7 +2717,7 @@
                 <w:sz w:val="20"/>
                 <w:szCs w:val="20"/>
               </w:rPr>
-              <w:t xml:space="preserve">Taboada et al. (2011)</w:t>
+              <w:t xml:space="preserve">Jurafsky &amp; Martin (2026)</w:t>
             </w:r>
           </w:p>
         </w:tc>
@@ -2730,7 +2747,7 @@
                 <w:sz w:val="20"/>
                 <w:szCs w:val="20"/>
               </w:rPr>
-              <w:t xml:space="preserve">Lexicon-based sentiment with intensification and negation rules</w:t>
+              <w:t xml:space="preserve">Sentiment lexicons, TF-IDF, logistic regression, evaluation</w:t>
             </w:r>
           </w:p>
         </w:tc>
@@ -2760,7 +2777,7 @@
                 <w:sz w:val="20"/>
                 <w:szCs w:val="20"/>
               </w:rPr>
-              <w:t xml:space="preserve">Rule design: negation, intensifiers</w:t>
+              <w:t xml:space="preserve">Foundations of the analyser, baseline and metrics</w:t>
             </w:r>
           </w:p>
         </w:tc>
@@ -2795,7 +2812,7 @@
                 <w:sz w:val="20"/>
                 <w:szCs w:val="20"/>
               </w:rPr>
-              <w:t xml:space="preserve">Pontiki et al. (2014, 2016)</w:t>
+              <w:t xml:space="preserve">Shi &amp; Agrawal (2025)</w:t>
             </w:r>
           </w:p>
         </w:tc>
@@ -2825,7 +2842,7 @@
                 <w:sz w:val="20"/>
                 <w:szCs w:val="20"/>
               </w:rPr>
-              <w:t xml:space="preserve">SemEval ABSA tasks; restaurant reviews; Arabic hotel reviews in 2016</w:t>
+              <w:t xml:space="preserve">Survey of contemporary Arabic sentiment analysis</w:t>
             </w:r>
           </w:p>
         </w:tc>
@@ -2855,7 +2872,7 @@
                 <w:sz w:val="20"/>
                 <w:szCs w:val="20"/>
               </w:rPr>
-              <w:t xml:space="preserve">Task definition and aspect categories</w:t>
+              <w:t xml:space="preserve">Challenges of Arabic; value of lexicons for interpretability</w:t>
             </w:r>
           </w:p>
         </w:tc>
@@ -2890,7 +2907,7 @@
                 <w:sz w:val="20"/>
                 <w:szCs w:val="20"/>
               </w:rPr>
-              <w:t xml:space="preserve">Schouten &amp; Frasincar (2016)</w:t>
+              <w:t xml:space="preserve">Bensoltane &amp; Zaki (2022)</w:t>
             </w:r>
           </w:p>
         </w:tc>
@@ -2920,7 +2937,7 @@
                 <w:sz w:val="20"/>
                 <w:szCs w:val="20"/>
               </w:rPr>
-              <w:t xml:space="preserve">Survey of aspect-level sentiment analysis</w:t>
+              <w:t xml:space="preserve">Review of Arabic ABSA</w:t>
             </w:r>
           </w:p>
         </w:tc>
@@ -2950,7 +2967,7 @@
                 <w:sz w:val="20"/>
                 <w:szCs w:val="20"/>
               </w:rPr>
-              <w:t xml:space="preserve">Proximity-based aspect assignment</w:t>
+              <w:t xml:space="preserve">Open challenges: resources, domains, dialects</w:t>
             </w:r>
           </w:p>
         </w:tc>
@@ -2985,7 +3002,7 @@
                 <w:sz w:val="20"/>
                 <w:szCs w:val="20"/>
               </w:rPr>
-              <w:t xml:space="preserve">Aly &amp; Atiya (2013); Nabil et al. (2015); Elnagar et al. (2018)</w:t>
+              <w:t xml:space="preserve">Al-Dabet et al. (2021); Abdelgwad et al. (2022)</w:t>
             </w:r>
           </w:p>
         </w:tc>
@@ -3015,7 +3032,7 @@
                 <w:sz w:val="20"/>
                 <w:szCs w:val="20"/>
               </w:rPr>
-              <w:t xml:space="preserve">Arabic sentiment datasets: books, tweets, hotels</w:t>
+              <w:t xml:space="preserve">Deep-learning Arabic ABSA on hotel reviews</w:t>
             </w:r>
           </w:p>
         </w:tc>
@@ -3045,7 +3062,7 @@
                 <w:sz w:val="20"/>
                 <w:szCs w:val="20"/>
               </w:rPr>
-              <w:t xml:space="preserve">Shows the importance of domain-specific data</w:t>
+              <w:t xml:space="preserve">Arabic ABSA baselines</w:t>
             </w:r>
           </w:p>
         </w:tc>
@@ -3080,7 +3097,7 @@
                 <w:sz w:val="20"/>
                 <w:szCs w:val="20"/>
               </w:rPr>
-              <w:t xml:space="preserve">ElSahar &amp; El-Beltagy (2015)</w:t>
+              <w:t xml:space="preserve">Abdul-Mageed et al. (2021); Inoue et al. (2021)</w:t>
             </w:r>
           </w:p>
         </w:tc>
@@ -3110,7 +3127,7 @@
                 <w:sz w:val="20"/>
                 <w:szCs w:val="20"/>
               </w:rPr>
-              <w:t xml:space="preserve">Multi-domain Arabic resources and lexicons</w:t>
+              <w:t xml:space="preserve">Arabic pre-trained language models (MARBERT, CAMeLBERT)</w:t>
             </w:r>
           </w:p>
         </w:tc>
@@ -3140,7 +3157,7 @@
                 <w:sz w:val="20"/>
                 <w:szCs w:val="20"/>
               </w:rPr>
-              <w:t xml:space="preserve">Domain lexicons, including restaurants</w:t>
+              <w:t xml:space="preserve">Optional Transformer extension</w:t>
             </w:r>
           </w:p>
         </w:tc>
@@ -3175,7 +3192,7 @@
                 <w:sz w:val="20"/>
                 <w:szCs w:val="20"/>
               </w:rPr>
-              <w:t xml:space="preserve">Al-Twairesh et al. (2017); Assiri et al. (2018)</w:t>
+              <w:t xml:space="preserve">Khondaker et al. (2023); Al-Thubaity et al. (2023)</w:t>
             </w:r>
           </w:p>
         </w:tc>
@@ -3205,7 +3222,7 @@
                 <w:sz w:val="20"/>
                 <w:szCs w:val="20"/>
               </w:rPr>
-              <w:t xml:space="preserve">Saudi-dialect corpus; lexicon enhancement for Saudi dialect</w:t>
+              <w:t xml:space="preserve">Evaluation of ChatGPT, GPT-4 and Bard on Arabic tasks</w:t>
             </w:r>
           </w:p>
         </w:tc>
@@ -3235,7 +3252,7 @@
                 <w:sz w:val="20"/>
                 <w:szCs w:val="20"/>
               </w:rPr>
-              <w:t xml:space="preserve">Dialect vocabulary and negation rules</w:t>
+              <w:t xml:space="preserve">Why LLMs were not used as the core</w:t>
             </w:r>
           </w:p>
         </w:tc>
@@ -3270,7 +3287,7 @@
                 <w:sz w:val="20"/>
                 <w:szCs w:val="20"/>
               </w:rPr>
-              <w:t xml:space="preserve">Al-Smadi et al. (2018)</w:t>
+              <w:t xml:space="preserve">Abu Farha et al. (2021)</w:t>
             </w:r>
           </w:p>
         </w:tc>
@@ -3300,7 +3317,7 @@
                 <w:sz w:val="20"/>
                 <w:szCs w:val="20"/>
               </w:rPr>
-              <w:t xml:space="preserve">Arabic ABSA of hotel reviews: deep learning vs. SVM</w:t>
+              <w:t xml:space="preserve">Arabic sarcasm and sentiment shared task</w:t>
             </w:r>
           </w:p>
         </w:tc>
@@ -3330,7 +3347,7 @@
                 <w:sz w:val="20"/>
                 <w:szCs w:val="20"/>
               </w:rPr>
-              <w:t xml:space="preserve">Arabic ABSA baselines</w:t>
+              <w:t xml:space="preserve">Explains a known limitation; neutral class in evaluation</w:t>
             </w:r>
           </w:p>
         </w:tc>
@@ -3365,7 +3382,7 @@
                 <w:sz w:val="20"/>
                 <w:szCs w:val="20"/>
               </w:rPr>
-              <w:t xml:space="preserve">Antoun et al. (2020); Inoue et al. (2021)</w:t>
+              <w:t xml:space="preserve">Almuqren &amp; Cristea (2021)</w:t>
             </w:r>
           </w:p>
         </w:tc>
@@ -3395,7 +3412,7 @@
                 <w:sz w:val="20"/>
                 <w:szCs w:val="20"/>
               </w:rPr>
-              <w:t xml:space="preserve">Arabic pre-trained language models</w:t>
+              <w:t xml:space="preserve">Saudi-dialect sentiment corpus (telecom)</w:t>
             </w:r>
           </w:p>
         </w:tc>
@@ -3425,7 +3442,7 @@
                 <w:sz w:val="20"/>
                 <w:szCs w:val="20"/>
               </w:rPr>
-              <w:t xml:space="preserve">Optional Transformer extension</w:t>
+              <w:t xml:space="preserve">Saudi dialect resources</w:t>
             </w:r>
           </w:p>
         </w:tc>
@@ -3460,7 +3477,7 @@
                 <w:sz w:val="20"/>
                 <w:szCs w:val="20"/>
               </w:rPr>
-              <w:t xml:space="preserve">Abu Farha &amp; Magdy (2020)</w:t>
+              <w:t xml:space="preserve">Alharbi &amp; Qamar (2022)</w:t>
             </w:r>
           </w:p>
         </w:tc>
@@ -3490,7 +3507,7 @@
                 <w:sz w:val="20"/>
                 <w:szCs w:val="20"/>
               </w:rPr>
-              <w:t xml:space="preserve">Arabic sarcasm and sentiment</w:t>
+              <w:t xml:space="preserve">Sentiment of Arabic eatery reviews, Qassim</w:t>
             </w:r>
           </w:p>
         </w:tc>
@@ -3520,7 +3537,7 @@
                 <w:sz w:val="20"/>
                 <w:szCs w:val="20"/>
               </w:rPr>
-              <w:t xml:space="preserve">Explains a known limitation</w:t>
+              <w:t xml:space="preserve">Saudi restaurant domain</w:t>
             </w:r>
           </w:p>
         </w:tc>
@@ -3555,7 +3572,102 @@
                 <w:sz w:val="20"/>
                 <w:szCs w:val="20"/>
               </w:rPr>
-              <w:t xml:space="preserve">AQTE (bayandashnan, n.d.)</w:t>
+              <w:t xml:space="preserve">AlMasaud &amp; Al-Baity (2023)</w:t>
+            </w:r>
+          </w:p>
+        </w:tc>
+        <w:tc>
+          <w:tcPr>
+            <w:tcW w:type="dxa" w:w="3744"/>
+            <w:tcBorders>
+              <w:top w:val="single" w:color="8C8C8C" w:sz="4"/>
+              <w:left w:val="single" w:color="8C8C8C" w:sz="4"/>
+              <w:bottom w:val="single" w:color="8C8C8C" w:sz="4"/>
+              <w:right w:val="single" w:color="8C8C8C" w:sz="4"/>
+            </w:tcBorders>
+            <w:tcMar>
+              <w:top w:type="dxa" w:w="60"/>
+              <w:left w:type="dxa" w:w="100"/>
+              <w:bottom w:type="dxa" w:w="60"/>
+              <w:right w:type="dxa" w:w="100"/>
+            </w:tcMar>
+            <w:vAlign w:val="center"/>
+          </w:tcPr>
+          <w:p>
+            <w:pPr>
+              <w:spacing w:after="0" w:line="260"/>
+            </w:pPr>
+            <w:r>
+              <w:rPr>
+                <w:sz w:val="20"/>
+                <w:szCs w:val="20"/>
+              </w:rPr>
+              <w:t xml:space="preserve">ABSA corpora of Riyadh restaurant reviews (AraMA, AraMAMS)</w:t>
+            </w:r>
+          </w:p>
+        </w:tc>
+        <w:tc>
+          <w:tcPr>
+            <w:tcW w:type="dxa" w:w="2808"/>
+            <w:tcBorders>
+              <w:top w:val="single" w:color="8C8C8C" w:sz="4"/>
+              <w:left w:val="single" w:color="8C8C8C" w:sz="4"/>
+              <w:bottom w:val="single" w:color="8C8C8C" w:sz="4"/>
+              <w:right w:val="single" w:color="8C8C8C" w:sz="4"/>
+            </w:tcBorders>
+            <w:tcMar>
+              <w:top w:type="dxa" w:w="60"/>
+              <w:left w:type="dxa" w:w="100"/>
+              <w:bottom w:type="dxa" w:w="60"/>
+              <w:right w:type="dxa" w:w="100"/>
+            </w:tcMar>
+            <w:vAlign w:val="center"/>
+          </w:tcPr>
+          <w:p>
+            <w:pPr>
+              <w:spacing w:after="0" w:line="260"/>
+            </w:pPr>
+            <w:r>
+              <w:rPr>
+                <w:sz w:val="20"/>
+                <w:szCs w:val="20"/>
+              </w:rPr>
+              <w:t xml:space="preserve">Closest prior work; Google Maps restaurant ABSA</w:t>
+            </w:r>
+          </w:p>
+        </w:tc>
+      </w:tr>
+      <w:tr>
+        <w:trPr>
+          <w:cantSplit/>
+        </w:trPr>
+        <w:tc>
+          <w:tcPr>
+            <w:tcW w:type="dxa" w:w="2808"/>
+            <w:tcBorders>
+              <w:top w:val="single" w:color="8C8C8C" w:sz="4"/>
+              <w:left w:val="single" w:color="8C8C8C" w:sz="4"/>
+              <w:bottom w:val="single" w:color="8C8C8C" w:sz="4"/>
+              <w:right w:val="single" w:color="8C8C8C" w:sz="4"/>
+            </w:tcBorders>
+            <w:tcMar>
+              <w:top w:type="dxa" w:w="60"/>
+              <w:left w:type="dxa" w:w="100"/>
+              <w:bottom w:type="dxa" w:w="60"/>
+              <w:right w:type="dxa" w:w="100"/>
+            </w:tcMar>
+            <w:vAlign w:val="center"/>
+          </w:tcPr>
+          <w:p>
+            <w:pPr>
+              <w:spacing w:after="0" w:line="260"/>
+            </w:pPr>
+            <w:r>
+              <w:rPr>
+                <w:sz w:val="20"/>
+                <w:szCs w:val="20"/>
+              </w:rPr>
+              <w:t xml:space="preserve">AQTE (bayandashnan, 2026)</w:t>
             </w:r>
           </w:p>
         </w:tc>
@@ -3647,7 +3759,7 @@
         <w:jc w:val="both"/>
       </w:pPr>
       <w:r>
-        <w:t xml:space="preserve">The literature shows that aspect-based sentiment analysis is mature for English restaurant reviews and that Arabic sentiment resources exist for several domains and dialects. Three gaps remain that this project addresses:</w:t>
+        <w:t xml:space="preserve">Recent research shows that aspect-based sentiment analysis is well developed, that Arabic pre-trained models and LLMs are improving quickly, and that Saudi restaurant reviews have begun to receive attention. Three gaps remain that this project addresses:</w:t>
       </w:r>
     </w:p>
     <w:p>
@@ -3665,10 +3777,10 @@
           <w:b/>
           <w:bCs/>
         </w:rPr>
-        <w:t xml:space="preserve">Domain and dialect.</w:t>
-      </w:r>
-      <w:r>
-        <w:t xml:space="preserve"> Few tools target Saudi restaurant reviews specifically, at the aspect level, with vocabulary for Saudi dishes and dialectal expressions such as ‎"ماله طعم"‎, ‎"ما قصروا"‎ and ‎"يستاهل كل ريال"‎.</w:t>
+        <w:t xml:space="preserve">Transparency for dialectal restaurant reviews.</w:t>
+      </w:r>
+      <w:r>
+        <w:t xml:space="preserve"> Recent Arabic ABSA work relies mainly on deep learning and LLMs, which are hard to explain. Few systems offer an interpretable, documented lexicon for Saudi restaurant language, with dish vocabulary and dialectal expressions such as ‎"ماله طعم"‎, ‎"ما قصروا"‎ and ‎"يستاهل كل ريال"‎.</w:t>
       </w:r>
     </w:p>
     <w:p>
@@ -3689,7 +3801,7 @@
         <w:t xml:space="preserve">Usability.</w:t>
       </w:r>
       <w:r>
-        <w:t xml:space="preserve"> Research systems are usually scripts or models, not end-to-end applications that a restaurant owner can use in Arabic, with data import, dashboards, comparisons and reports.</w:t>
+        <w:t xml:space="preserve"> Research systems are usually models or scripts, not end-to-end applications that a restaurant owner can use in Arabic, with data import, dashboards, comparisons and reports, running locally without paid services.</w:t>
       </w:r>
     </w:p>
     <w:p>
@@ -3707,7 +3819,7 @@
           <w:b/>
           <w:bCs/>
         </w:rPr>
-        <w:t xml:space="preserve">Transparency and honest reporting.</w:t>
+        <w:t xml:space="preserve">Honest reporting.</w:t>
       </w:r>
       <w:r>
         <w:t xml:space="preserve"> Many tools report confident labels without evidence or uncertainty, and comparisons often ignore sample size. This project's analyser shows the supporting clause for every aspect decision, flags uncertain and mixed results, and refuses to rank restaurants with too few reviews.</w:t>
@@ -4708,7 +4820,7 @@
         <w:t xml:space="preserve">AQTE (Arabic Quote and Triplet Extraction)</w:t>
       </w:r>
       <w:r>
-        <w:t xml:space="preserve">, a dataset published on Hugging Face under the Creative Commons Attribution 4.0 (CC BY 4.0) licence (bayandashnan, n.d.). According to its documentation, AQTE contains 14,783 real customer reviews of 774 restaurants across Saudi Arabia, collected from Google Maps and written in multiple Arabic dialects, with 63,620 annotated opinion triplets spanning 29 aspect categories and three sentiment polarities. It was chosen because it matches the domain and region of the project exactly, and because its aspect-level annotations make it possible to evaluate not only overall sentiment but also aspect detection and aspect sentiment.</w:t>
+        <w:t xml:space="preserve">, a dataset published on Hugging Face under the Creative Commons Attribution 4.0 (CC BY 4.0) licence (bayandashnan, 2026). According to its documentation, AQTE contains 14,783 real customer reviews of 774 restaurants across Saudi Arabia, collected from Google Maps and written in multiple Arabic dialects, with 63,620 annotated opinion triplets spanning 29 aspect categories and three sentiment polarities. It was chosen because it matches the domain and region of the project exactly, and because its aspect-level annotations make it possible to evaluate not only overall sentiment but also aspect detection and aspect sentiment.</w:t>
       </w:r>
     </w:p>
     <w:p>
@@ -12492,7 +12604,7 @@
         <w:t xml:space="preserve">presentation layer</w:t>
       </w:r>
       <w:r>
-        <w:t xml:space="preserve"> consists of eight Streamlit pages in Arabic with a right-to-left layout. The </w:t>
+        <w:t xml:space="preserve"> consists of eight Streamlit pages (Streamlit Inc., 2026) in Arabic with a right-to-left layout. The </w:t>
       </w:r>
       <w:r>
         <w:rPr>
@@ -24097,7 +24209,7 @@
         <w:jc w:val="left"/>
       </w:pPr>
       <w:r>
-        <w:t xml:space="preserve">The neutral class was the weakest in every measurement (F1 of about 0.2 on the development sample). Three factors explain this. First, neutral reviews are rare (about 8% of the development sample), so few errors cost a large share of the class. Second, the boundary between neutral and mildly positive is blurred in practice: ‎"عادي"‎ (ordinary) or ‎"لا بأس"‎ (not bad) can be read either way. Third, a review annotated as neutral overall often contains both praise and complaints that cancel out in the reference labels, while the analyser weights the clause after ‎"بس"‎ more heavily and therefore leans to one side. The confusion matrices show that most neutral reviews were predicted as positive. This difficulty is widely reported in sentiment analysis research and is a known limitation of lexicon methods.</w:t>
+        <w:t xml:space="preserve">The neutral class was the weakest in every measurement (F1 of about 0.2 on the development sample). Three factors explain this. First, neutral reviews are rare (about 8% of the development sample), so few errors cost a large share of the class. Second, the boundary between neutral and mildly positive is blurred in practice: ‎"عادي"‎ (ordinary) or ‎"لا بأس"‎ (not bad) can be read either way. Third, a review annotated as neutral overall often contains both praise and complaints that cancel out in the reference labels, while the analyser weights the clause after ‎"بس"‎ more heavily and therefore leans to one side. The confusion matrices show that most neutral reviews were predicted as positive. The neutral class is also the hardest in shared evaluations of Arabic sentiment, which is why some benchmarks report F1 over the positive and negative classes only (Abu Farha et al., 2021); it is a known limitation of lexicon methods.</w:t>
       </w:r>
     </w:p>
     <w:p>
@@ -26101,7 +26213,7 @@
         <w:t xml:space="preserve">Sarcasm and numeric prices:</w:t>
       </w:r>
       <w:r>
-        <w:t xml:space="preserve"> detect sarcasm using resources such as ArSarcasm (Abu Farha &amp; Magdy, 2020), and interpret prices written as numbers (for example ‎"300 ريال"‎) so that price complaints without opinion words are recognised.</w:t>
+        <w:t xml:space="preserve"> detect sarcasm using resources such as ArSarcasm-v2 (Abu Farha et al., 2021), and interpret prices written as numbers (for example ‎"300 ريال"‎) so that price complaints without opinion words are recognised.</w:t>
       </w:r>
     </w:p>
     <w:p>
@@ -26164,17 +26276,17 @@
         <w:jc w:val="left"/>
       </w:pPr>
       <w:r>
-        <w:t xml:space="preserve">Abu Farha, I., &amp; Magdy, W. (2020). From Arabic sentiment analysis to sarcasm detection: The ArSarcasm dataset. In </w:t>
+        <w:t xml:space="preserve">Abdelgwad, M. M., Soliman, T. H. A., Taloba, A. I., &amp; Farghaly, M. F. (2022). Arabic aspect based sentiment analysis using bidirectional GRU based models. </w:t>
       </w:r>
       <w:r>
         <w:rPr>
           <w:i/>
           <w:iCs/>
         </w:rPr>
-        <w:t xml:space="preserve">Proceedings of the 4th Workshop on Open-Source Arabic Corpora and Processing Tools (OSACT4)</w:t>
-      </w:r>
-      <w:r>
-        <w:t xml:space="preserve"> (pp. 32–39). European Language Resources Association.</w:t>
+        <w:t xml:space="preserve">Journal of King Saud University – Computer and Information Sciences, 34</w:t>
+      </w:r>
+      <w:r>
+        <w:t xml:space="preserve">, 6652–6662. https://doi.org/10.1016/j.jksuci.2021.08.030</w:t>
       </w:r>
     </w:p>
     <w:p>
@@ -26184,17 +26296,17 @@
         <w:jc w:val="left"/>
       </w:pPr>
       <w:r>
-        <w:t xml:space="preserve">Al-Smadi, M., Qawasmeh, O., Al-Ayyoub, M., Jararweh, Y., &amp; Gupta, B. (2018). Deep recurrent neural network vs. support vector machine for aspect-based sentiment analysis of Arabic hotels' reviews. </w:t>
+        <w:t xml:space="preserve">Abdul-Mageed, M., Elmadany, A., &amp; Nagoudi, E. M. B. (2021). ARBERT &amp; MARBERT: Deep bidirectional transformers for Arabic. In </w:t>
       </w:r>
       <w:r>
         <w:rPr>
           <w:i/>
           <w:iCs/>
         </w:rPr>
-        <w:t xml:space="preserve">Journal of Computational Science, 27</w:t>
-      </w:r>
-      <w:r>
-        <w:t xml:space="preserve">, 386–393.</w:t>
+        <w:t xml:space="preserve">Proceedings of the 59th Annual Meeting of the Association for Computational Linguistics and the 11th International Joint Conference on Natural Language Processing (ACL-IJCNLP 2021)</w:t>
+      </w:r>
+      <w:r>
+        <w:t xml:space="preserve"> (pp. 7088–7105). Association for Computational Linguistics. https://doi.org/10.18653/v1/2021.acl-long.551</w:t>
       </w:r>
     </w:p>
     <w:p>
@@ -26204,17 +26316,17 @@
         <w:jc w:val="left"/>
       </w:pPr>
       <w:r>
-        <w:t xml:space="preserve">Al-Twairesh, N., Al-Khalifa, H., Al-Salman, A., &amp; Al-Ohali, Y. (2017). AraSenTi-Tweet: A corpus for Arabic sentiment analysis of Saudi tweets. </w:t>
+        <w:t xml:space="preserve">Abu Farha, I., Zaghouani, W., &amp; Magdy, W. (2021). Overview of the WANLP 2021 shared task on sarcasm and sentiment detection in Arabic. In </w:t>
       </w:r>
       <w:r>
         <w:rPr>
           <w:i/>
           <w:iCs/>
         </w:rPr>
-        <w:t xml:space="preserve">Procedia Computer Science, 117</w:t>
-      </w:r>
-      <w:r>
-        <w:t xml:space="preserve">, 63–72.</w:t>
+        <w:t xml:space="preserve">Proceedings of the Sixth Arabic Natural Language Processing Workshop</w:t>
+      </w:r>
+      <w:r>
+        <w:t xml:space="preserve"> (pp. 296–305). Association for Computational Linguistics.</w:t>
       </w:r>
     </w:p>
     <w:p>
@@ -26224,17 +26336,17 @@
         <w:jc w:val="left"/>
       </w:pPr>
       <w:r>
-        <w:t xml:space="preserve">Aly, M., &amp; Atiya, A. (2013). LABR: A large scale Arabic book reviews dataset. In </w:t>
+        <w:t xml:space="preserve">Al-Dabet, S., Tedmori, S., &amp; Al-Smadi, M. (2021). Enhancing Arabic aspect-based sentiment analysis using deep learning models. </w:t>
       </w:r>
       <w:r>
         <w:rPr>
           <w:i/>
           <w:iCs/>
         </w:rPr>
-        <w:t xml:space="preserve">Proceedings of the 51st Annual Meeting of the Association for Computational Linguistics (Volume 2: Short Papers)</w:t>
-      </w:r>
-      <w:r>
-        <w:t xml:space="preserve"> (pp. 494–498).</w:t>
+        <w:t xml:space="preserve">Computer Speech &amp; Language, 69</w:t>
+      </w:r>
+      <w:r>
+        <w:t xml:space="preserve">.</w:t>
       </w:r>
     </w:p>
     <w:p>
@@ -26244,17 +26356,17 @@
         <w:jc w:val="left"/>
       </w:pPr>
       <w:r>
-        <w:t xml:space="preserve">Antoun, W., Baly, F., &amp; Hajj, H. (2020). AraBERT: Transformer-based model for Arabic language understanding. In </w:t>
+        <w:t xml:space="preserve">Alharbi, L. M., &amp; Qamar, A. M. (2022). Arabic sentiment analysis of eateries' reviews using deep learning. </w:t>
       </w:r>
       <w:r>
         <w:rPr>
           <w:i/>
           <w:iCs/>
         </w:rPr>
-        <w:t xml:space="preserve">Proceedings of the 4th Workshop on Open-Source Arabic Corpora and Processing Tools (OSACT4)</w:t>
-      </w:r>
-      <w:r>
-        <w:t xml:space="preserve"> (pp. 9–15).</w:t>
+        <w:t xml:space="preserve">Ingénierie des Systèmes d'Information, 27</w:t>
+      </w:r>
+      <w:r>
+        <w:t xml:space="preserve">(3), 503–508.</w:t>
       </w:r>
     </w:p>
     <w:p>
@@ -26264,17 +26376,17 @@
         <w:jc w:val="left"/>
       </w:pPr>
       <w:r>
-        <w:t xml:space="preserve">Assiri, A., Emam, A., &amp; Al-Dossari, H. (2018). Towards enhancement of a lexicon-based approach for Saudi dialect sentiment analysis. </w:t>
+        <w:t xml:space="preserve">AlMasaud, A., &amp; Al-Baity, H. H. (2023). AraMAMS: Arabic multi-aspect, multi-sentiment restaurants reviews corpus for aspect-based sentiment analysis. </w:t>
       </w:r>
       <w:r>
         <w:rPr>
           <w:i/>
           <w:iCs/>
         </w:rPr>
-        <w:t xml:space="preserve">Journal of Information Science, 44</w:t>
-      </w:r>
-      <w:r>
-        <w:t xml:space="preserve">(2), 184–202.</w:t>
+        <w:t xml:space="preserve">Sustainability, 15</w:t>
+      </w:r>
+      <w:r>
+        <w:t xml:space="preserve">(16), 12268. https://doi.org/10.3390/su151612268</w:t>
       </w:r>
     </w:p>
     <w:p>
@@ -26284,17 +26396,17 @@
         <w:jc w:val="left"/>
       </w:pPr>
       <w:r>
-        <w:t xml:space="preserve">Badaro, G., Baly, R., Hajj, H., Habash, N., &amp; El-Hajj, W. (2014). A large scale Arabic sentiment lexicon for Arabic opinion mining. In </w:t>
+        <w:t xml:space="preserve">Almuqren, L., &amp; Cristea, A. (2021). AraCust: A Saudi telecom tweets corpus for sentiment analysis. </w:t>
       </w:r>
       <w:r>
         <w:rPr>
           <w:i/>
           <w:iCs/>
         </w:rPr>
-        <w:t xml:space="preserve">Proceedings of the EMNLP 2014 Workshop on Arabic Natural Language Processing (ANLP)</w:t>
-      </w:r>
-      <w:r>
-        <w:t xml:space="preserve"> (pp. 165–173).</w:t>
+        <w:t xml:space="preserve">PeerJ Computer Science, 7</w:t>
+      </w:r>
+      <w:r>
+        <w:t xml:space="preserve">, e510. https://doi.org/10.7717/peerj-cs.510</w:t>
       </w:r>
     </w:p>
     <w:p>
@@ -26304,7 +26416,27 @@
         <w:jc w:val="left"/>
       </w:pPr>
       <w:r>
-        <w:t xml:space="preserve">bayandashnan. (n.d.). </w:t>
+        <w:t xml:space="preserve">Al-Thubaity, A., Alkhereyf, S., Murayshid, H., Alshalawi, N., Omirah, M., Alateeq, R., Almutairi, R., Alsuwailem, R., Alhassoun, M., &amp; Alkhanen, I. (2023). Evaluating ChatGPT and Bard AI on Arabic sentiment analysis. In </w:t>
+      </w:r>
+      <w:r>
+        <w:rPr>
+          <w:i/>
+          <w:iCs/>
+        </w:rPr>
+        <w:t xml:space="preserve">Proceedings of ArabicNLP 2023</w:t>
+      </w:r>
+      <w:r>
+        <w:t xml:space="preserve"> (pp. 335–349). Association for Computational Linguistics. https://doi.org/10.18653/v1/2023.arabicnlp-1.27</w:t>
+      </w:r>
+    </w:p>
+    <w:p>
+      <w:pPr>
+        <w:spacing w:after="120"/>
+        <w:ind w:left="720" w:hanging="720"/>
+        <w:jc w:val="left"/>
+      </w:pPr>
+      <w:r>
+        <w:t xml:space="preserve">bayandashnan. (2026). </w:t>
       </w:r>
       <w:r>
         <w:rPr>
@@ -26331,17 +26463,27 @@
         <w:jc w:val="left"/>
       </w:pPr>
       <w:r>
-        <w:t xml:space="preserve">Boudad, N., Faizi, R., Oulad Haj Thami, R., &amp; Chiheb, R. (2018). Sentiment analysis in Arabic: A review of the literature. </w:t>
+        <w:t xml:space="preserve">Bensoltane, R., &amp; Zaki, T. (2022). Aspect-based sentiment analysis: An overview in the use of Arabic language. </w:t>
       </w:r>
       <w:r>
         <w:rPr>
           <w:i/>
           <w:iCs/>
         </w:rPr>
-        <w:t xml:space="preserve">Ain Shams Engineering Journal, 9</w:t>
-      </w:r>
-      <w:r>
-        <w:t xml:space="preserve">(4), 2479–2490.</w:t>
+        <w:t xml:space="preserve">Artificial Intelligence Review</w:t>
+      </w:r>
+      <w:r>
+        <w:t xml:space="preserve">, </w:t>
+      </w:r>
+      <w:r>
+        <w:rPr>
+          <w:highlight w:val="yellow"/>
+          <w:highlightCs w:val="yellow"/>
+        </w:rPr>
+        <w:t xml:space="preserve">[volume(issue), pages]</w:t>
+      </w:r>
+      <w:r>
+        <w:t xml:space="preserve">. https://doi.org/10.1007/s10462-022-10215-3</w:t>
       </w:r>
     </w:p>
     <w:p>
@@ -26351,17 +26493,17 @@
         <w:jc w:val="left"/>
       </w:pPr>
       <w:r>
-        <w:t xml:space="preserve">ElSahar, H., &amp; El-Beltagy, S. R. (2015). Building large Arabic multi-domain resources for sentiment analysis. In </w:t>
+        <w:t xml:space="preserve">Inoue, G., Alhafni, B., Baimukan, N., Bouamor, H., &amp; Habash, N. (2021). The interplay of variant, size, and task type in Arabic pre-trained language models. In </w:t>
       </w:r>
       <w:r>
         <w:rPr>
           <w:i/>
           <w:iCs/>
         </w:rPr>
-        <w:t xml:space="preserve">Computational Linguistics and Intelligent Text Processing (CICLing 2015)</w:t>
-      </w:r>
-      <w:r>
-        <w:t xml:space="preserve">, Lecture Notes in Computer Science (Vol. 9042, pp. 23–34). Springer.</w:t>
+        <w:t xml:space="preserve">Proceedings of the Sixth Arabic Natural Language Processing Workshop</w:t>
+      </w:r>
+      <w:r>
+        <w:t xml:space="preserve"> (pp. 92–104). Association for Computational Linguistics.</w:t>
       </w:r>
     </w:p>
     <w:p>
@@ -26371,17 +26513,17 @@
         <w:jc w:val="left"/>
       </w:pPr>
       <w:r>
-        <w:t xml:space="preserve">Elnagar, A., Khalifa, Y. S., &amp; Einea, A. (2018). Hotel Arabic-reviews dataset construction for sentiment analysis applications. In K. Shaalan, A. E. Hassanien, &amp; F. Tolba (Eds.), </w:t>
+        <w:t xml:space="preserve">Jurafsky, D., &amp; Martin, J. H. (2026). </w:t>
       </w:r>
       <w:r>
         <w:rPr>
           <w:i/>
           <w:iCs/>
         </w:rPr>
-        <w:t xml:space="preserve">Intelligent Natural Language Processing: Trends and Applications</w:t>
-      </w:r>
-      <w:r>
-        <w:t xml:space="preserve"> (pp. 35–52). Springer.</w:t>
+        <w:t xml:space="preserve">Speech and language processing</w:t>
+      </w:r>
+      <w:r>
+        <w:t xml:space="preserve"> (3rd ed. draft). Stanford University. https://web.stanford.edu/~jurafsky/slp3/</w:t>
       </w:r>
     </w:p>
     <w:p>
@@ -26391,17 +26533,17 @@
         <w:jc w:val="left"/>
       </w:pPr>
       <w:r>
-        <w:t xml:space="preserve">Habash, N. Y. (2010). </w:t>
+        <w:t xml:space="preserve">Khondaker, M. T. I., Waheed, A., Nagoudi, E. M. B., &amp; Abdul-Mageed, M. (2023). GPTAraEval: A comprehensive evaluation of ChatGPT on Arabic NLP. In </w:t>
       </w:r>
       <w:r>
         <w:rPr>
           <w:i/>
           <w:iCs/>
         </w:rPr>
-        <w:t xml:space="preserve">Introduction to Arabic natural language processing</w:t>
-      </w:r>
-      <w:r>
-        <w:t xml:space="preserve">. Morgan &amp; Claypool.</w:t>
+        <w:t xml:space="preserve">Proceedings of the 2023 Conference on Empirical Methods in Natural Language Processing</w:t>
+      </w:r>
+      <w:r>
+        <w:t xml:space="preserve"> (pp. 220–247). Association for Computational Linguistics.</w:t>
       </w:r>
     </w:p>
     <w:p>
@@ -26411,17 +26553,17 @@
         <w:jc w:val="left"/>
       </w:pPr>
       <w:r>
-        <w:t xml:space="preserve">Hu, M., &amp; Liu, B. (2004). Mining and summarizing customer reviews. In </w:t>
+        <w:t xml:space="preserve">scikit-learn developers. (2026). </w:t>
       </w:r>
       <w:r>
         <w:rPr>
           <w:i/>
           <w:iCs/>
         </w:rPr>
-        <w:t xml:space="preserve">Proceedings of the 10th ACM SIGKDD International Conference on Knowledge Discovery and Data Mining</w:t>
-      </w:r>
-      <w:r>
-        <w:t xml:space="preserve"> (pp. 168–177).</w:t>
+        <w:t xml:space="preserve">scikit-learn: Machine learning in Python</w:t>
+      </w:r>
+      <w:r>
+        <w:t xml:space="preserve"> [Documentation]. https://scikit-learn.org/stable/</w:t>
       </w:r>
     </w:p>
     <w:p>
@@ -26431,17 +26573,17 @@
         <w:jc w:val="left"/>
       </w:pPr>
       <w:r>
-        <w:t xml:space="preserve">Inoue, G., Alhafni, B., Baimukan, N., Bouamor, H., &amp; Habash, N. (2021). The interplay of variant, size, and task type in Arabic pre-trained language models. In </w:t>
+        <w:t xml:space="preserve">Shi, Z., &amp; Agrawal, R. (2025). A comprehensive survey of contemporary Arabic sentiment analysis: Methods, challenges, and future directions. In </w:t>
       </w:r>
       <w:r>
         <w:rPr>
           <w:i/>
           <w:iCs/>
         </w:rPr>
-        <w:t xml:space="preserve">Proceedings of the Sixth Arabic Natural Language Processing Workshop (WANLP)</w:t>
-      </w:r>
-      <w:r>
-        <w:t xml:space="preserve"> (pp. 92–104).</w:t>
+        <w:t xml:space="preserve">Findings of the Association for Computational Linguistics: NAACL 2025</w:t>
+      </w:r>
+      <w:r>
+        <w:t xml:space="preserve"> (pp. 3760–3772). Association for Computational Linguistics.</w:t>
       </w:r>
     </w:p>
     <w:p>
@@ -26451,17 +26593,17 @@
         <w:jc w:val="left"/>
       </w:pPr>
       <w:r>
-        <w:t xml:space="preserve">Liu, B. (2012). </w:t>
+        <w:t xml:space="preserve">Streamlit Inc. (2026). </w:t>
       </w:r>
       <w:r>
         <w:rPr>
           <w:i/>
           <w:iCs/>
         </w:rPr>
-        <w:t xml:space="preserve">Sentiment analysis and opinion mining</w:t>
-      </w:r>
-      <w:r>
-        <w:t xml:space="preserve">. Morgan &amp; Claypool.</w:t>
+        <w:t xml:space="preserve">Streamlit documentation</w:t>
+      </w:r>
+      <w:r>
+        <w:t xml:space="preserve">. https://docs.streamlit.io/</w:t>
       </w:r>
     </w:p>
     <w:p>
@@ -26471,217 +26613,17 @@
         <w:jc w:val="left"/>
       </w:pPr>
       <w:r>
-        <w:t xml:space="preserve">Manning, C. D., Raghavan, P., &amp; Schütze, H. (2008). </w:t>
+        <w:t xml:space="preserve">Zhang, W., Li, X., Deng, Y., Bing, L., &amp; Lam, W. (2023). A survey on aspect-based sentiment analysis: Tasks, methods, and challenges. </w:t>
       </w:r>
       <w:r>
         <w:rPr>
           <w:i/>
           <w:iCs/>
         </w:rPr>
-        <w:t xml:space="preserve">Introduction to information retrieval</w:t>
-      </w:r>
-      <w:r>
-        <w:t xml:space="preserve">. Cambridge University Press.</w:t>
-      </w:r>
-    </w:p>
-    <w:p>
-      <w:pPr>
-        <w:spacing w:after="120"/>
-        <w:ind w:left="720" w:hanging="720"/>
-        <w:jc w:val="left"/>
-      </w:pPr>
-      <w:r>
-        <w:t xml:space="preserve">Nabil, M., Aly, M., &amp; Atiya, A. (2015). ASTD: Arabic sentiment tweets dataset. In </w:t>
-      </w:r>
-      <w:r>
-        <w:rPr>
-          <w:i/>
-          <w:iCs/>
-        </w:rPr>
-        <w:t xml:space="preserve">Proceedings of the 2015 Conference on Empirical Methods in Natural Language Processing</w:t>
-      </w:r>
-      <w:r>
-        <w:t xml:space="preserve"> (pp. 2515–2519).</w:t>
-      </w:r>
-    </w:p>
-    <w:p>
-      <w:pPr>
-        <w:spacing w:after="120"/>
-        <w:ind w:left="720" w:hanging="720"/>
-        <w:jc w:val="left"/>
-      </w:pPr>
-      <w:r>
-        <w:t xml:space="preserve">Pang, B., &amp; Lee, L. (2008). Opinion mining and sentiment analysis. </w:t>
-      </w:r>
-      <w:r>
-        <w:rPr>
-          <w:i/>
-          <w:iCs/>
-        </w:rPr>
-        <w:t xml:space="preserve">Foundations and Trends in Information Retrieval, 2</w:t>
-      </w:r>
-      <w:r>
-        <w:t xml:space="preserve">(1–2), 1–135.</w:t>
-      </w:r>
-    </w:p>
-    <w:p>
-      <w:pPr>
-        <w:spacing w:after="120"/>
-        <w:ind w:left="720" w:hanging="720"/>
-        <w:jc w:val="left"/>
-      </w:pPr>
-      <w:r>
-        <w:t xml:space="preserve">Pedregosa, F., Varoquaux, G., Gramfort, A., Michel, V., Thirion, B., Grisel, O., et al. (2011). Scikit-learn: Machine learning in Python. </w:t>
-      </w:r>
-      <w:r>
-        <w:rPr>
-          <w:i/>
-          <w:iCs/>
-        </w:rPr>
-        <w:t xml:space="preserve">Journal of Machine Learning Research, 12</w:t>
-      </w:r>
-      <w:r>
-        <w:t xml:space="preserve">, 2825–2830.</w:t>
-      </w:r>
-    </w:p>
-    <w:p>
-      <w:pPr>
-        <w:spacing w:after="120"/>
-        <w:ind w:left="720" w:hanging="720"/>
-        <w:jc w:val="left"/>
-      </w:pPr>
-      <w:r>
-        <w:t xml:space="preserve">Pontiki, M., Galanis, D., Pavlopoulos, J., Papageorgiou, H., Androutsopoulos, I., &amp; Manandhar, S. (2014). SemEval-2014 Task 4: Aspect based sentiment analysis. In </w:t>
-      </w:r>
-      <w:r>
-        <w:rPr>
-          <w:i/>
-          <w:iCs/>
-        </w:rPr>
-        <w:t xml:space="preserve">Proceedings of the 8th International Workshop on Semantic Evaluation (SemEval 2014)</w:t>
-      </w:r>
-      <w:r>
-        <w:t xml:space="preserve"> (pp. 27–35).</w:t>
-      </w:r>
-    </w:p>
-    <w:p>
-      <w:pPr>
-        <w:spacing w:after="120"/>
-        <w:ind w:left="720" w:hanging="720"/>
-        <w:jc w:val="left"/>
-      </w:pPr>
-      <w:r>
-        <w:t xml:space="preserve">Pontiki, M., Galanis, D., Papageorgiou, H., Androutsopoulos, I., Manandhar, S., Al-Smadi, M., et al. (2016). SemEval-2016 Task 5: Aspect based sentiment analysis. In </w:t>
-      </w:r>
-      <w:r>
-        <w:rPr>
-          <w:i/>
-          <w:iCs/>
-        </w:rPr>
-        <w:t xml:space="preserve">Proceedings of the 10th International Workshop on Semantic Evaluation (SemEval-2016)</w:t>
-      </w:r>
-      <w:r>
-        <w:t xml:space="preserve"> (pp. 19–30).</w:t>
-      </w:r>
-    </w:p>
-    <w:p>
-      <w:pPr>
-        <w:spacing w:after="120"/>
-        <w:ind w:left="720" w:hanging="720"/>
-        <w:jc w:val="left"/>
-      </w:pPr>
-      <w:r>
-        <w:t xml:space="preserve">Schouten, K., &amp; Frasincar, F. (2016). Survey on aspect-level sentiment analysis. </w:t>
-      </w:r>
-      <w:r>
-        <w:rPr>
-          <w:i/>
-          <w:iCs/>
-        </w:rPr>
-        <w:t xml:space="preserve">IEEE Transactions on Knowledge and Data Engineering, 28</w:t>
-      </w:r>
-      <w:r>
-        <w:t xml:space="preserve">(3), 813–830.</w:t>
-      </w:r>
-    </w:p>
-    <w:p>
-      <w:pPr>
-        <w:spacing w:after="120"/>
-        <w:ind w:left="720" w:hanging="720"/>
-        <w:jc w:val="left"/>
-      </w:pPr>
-      <w:r>
-        <w:t xml:space="preserve">Sokolova, M., &amp; Lapalme, G. (2009). A systematic analysis of performance measures for classification tasks. </w:t>
-      </w:r>
-      <w:r>
-        <w:rPr>
-          <w:i/>
-          <w:iCs/>
-        </w:rPr>
-        <w:t xml:space="preserve">Information Processing &amp; Management, 45</w:t>
-      </w:r>
-      <w:r>
-        <w:t xml:space="preserve">(4), 427–437.</w:t>
-      </w:r>
-    </w:p>
-    <w:p>
-      <w:pPr>
-        <w:spacing w:after="120"/>
-        <w:ind w:left="720" w:hanging="720"/>
-        <w:jc w:val="left"/>
-      </w:pPr>
-      <w:r>
-        <w:t xml:space="preserve">Taboada, M., Brooke, J., Tofiloski, M., Voll, K., &amp; Stede, M. (2011). Lexicon-based methods for sentiment analysis. </w:t>
-      </w:r>
-      <w:r>
-        <w:rPr>
-          <w:i/>
-          <w:iCs/>
-        </w:rPr>
-        <w:t xml:space="preserve">Computational Linguistics, 37</w:t>
-      </w:r>
-      <w:r>
-        <w:t xml:space="preserve">(2), 267–307.</w:t>
-      </w:r>
-    </w:p>
-    <w:p>
-      <w:pPr>
-        <w:spacing w:after="120"/>
-        <w:ind w:left="720" w:hanging="720"/>
-        <w:jc w:val="left"/>
-      </w:pPr>
-      <w:r>
-        <w:t xml:space="preserve">Wilson, E. B. (1927). Probable inference, the law of succession, and statistical inference. </w:t>
-      </w:r>
-      <w:r>
-        <w:rPr>
-          <w:i/>
-          <w:iCs/>
-        </w:rPr>
-        <w:t xml:space="preserve">Journal of the American Statistical Association, 22</w:t>
-      </w:r>
-      <w:r>
-        <w:t xml:space="preserve">(158), 209–212.</w:t>
-      </w:r>
-    </w:p>
-    <w:p>
-      <w:pPr>
-        <w:spacing w:after="120"/>
-        <w:ind w:left="720" w:hanging="720"/>
-        <w:jc w:val="left"/>
-      </w:pPr>
-      <w:r>
-        <w:t xml:space="preserve">Zhang, L., Wang, S., &amp; Liu, B. (2018). Deep learning for sentiment analysis: A survey. </w:t>
-      </w:r>
-      <w:r>
-        <w:rPr>
-          <w:i/>
-          <w:iCs/>
-        </w:rPr>
-        <w:t xml:space="preserve">WIREs Data Mining and Knowledge Discovery, 8</w:t>
-      </w:r>
-      <w:r>
-        <w:t xml:space="preserve">(4), e1253.</w:t>
+        <w:t xml:space="preserve">IEEE Transactions on Knowledge and Data Engineering, 35</w:t>
+      </w:r>
+      <w:r>
+        <w:t xml:space="preserve">(11), 11019–11038. https://doi.org/10.1109/TKDE.2022.3230975</w:t>
       </w:r>
     </w:p>
     <w:p>

</xml_diff>